<commit_message>
chore: update SP logo block
</commit_message>
<xml_diff>
--- a/inst/assets/ippo_report.docx
+++ b/inst/assets/ippo_report.docx
@@ -1,6 +1,6 @@
 
 <file path=word/document.xml><?xml version="1.0" encoding="utf-8"?>
-<w:document xmlns:wpc="http://schemas.microsoft.com/office/word/2010/wordprocessingCanvas" xmlns:cx="http://schemas.microsoft.com/office/drawing/2014/chartex" xmlns:cx1="http://schemas.microsoft.com/office/drawing/2015/9/8/chartex" xmlns:cx2="http://schemas.microsoft.com/office/drawing/2015/10/21/chartex" xmlns:cx3="http://schemas.microsoft.com/office/drawing/2016/5/9/chartex" xmlns:cx4="http://schemas.microsoft.com/office/drawing/2016/5/10/chartex" xmlns:cx5="http://schemas.microsoft.com/office/drawing/2016/5/11/chartex" xmlns:cx6="http://schemas.microsoft.com/office/drawing/2016/5/12/chartex" xmlns:cx7="http://schemas.microsoft.com/office/drawing/2016/5/13/chartex" xmlns:cx8="http://schemas.microsoft.com/office/drawing/2016/5/14/chartex" xmlns:mc="http://schemas.openxmlformats.org/markup-compatibility/2006" xmlns:aink="http://schemas.microsoft.com/office/drawing/2016/ink" xmlns:am3d="http://schemas.microsoft.com/office/drawing/2017/model3d" xmlns:o="urn:schemas-microsoft-com:office:office" xmlns:oel="http://schemas.microsoft.com/office/2019/extlst" xmlns:r="http://schemas.openxmlformats.org/officeDocument/2006/relationships" xmlns:m="http://schemas.openxmlformats.org/officeDocument/2006/math" xmlns:v="urn:schemas-microsoft-com:vml" xmlns:wp14="http://schemas.microsoft.com/office/word/2010/wordprocessingDrawing" xmlns:wp="http://schemas.openxmlformats.org/drawingml/2006/wordprocessingDrawing" xmlns:w10="urn:schemas-microsoft-com:office:word" xmlns:w="http://schemas.openxmlformats.org/wordprocessingml/2006/main" xmlns:w14="http://schemas.microsoft.com/office/word/2010/wordml" xmlns:w15="http://schemas.microsoft.com/office/word/2012/wordml" xmlns:w16cex="http://schemas.microsoft.com/office/word/2018/wordml/cex" xmlns:w16cid="http://schemas.microsoft.com/office/word/2016/wordml/cid" xmlns:w16="http://schemas.microsoft.com/office/word/2018/wordml" xmlns:w16du="http://schemas.microsoft.com/office/word/2023/wordml/word16du" xmlns:w16sdtdh="http://schemas.microsoft.com/office/word/2020/wordml/sdtdatahash" xmlns:w16sdtfl="http://schemas.microsoft.com/office/word/2024/wordml/sdtformatlock" xmlns:w16se="http://schemas.microsoft.com/office/word/2015/wordml/symex" xmlns:wpg="http://schemas.microsoft.com/office/word/2010/wordprocessingGroup" xmlns:wpi="http://schemas.microsoft.com/office/word/2010/wordprocessingInk" xmlns:wne="http://schemas.microsoft.com/office/word/2006/wordml" xmlns:wps="http://schemas.microsoft.com/office/word/2010/wordprocessingShape" mc:Ignorable="w14 w15 w16se w16cid w16 w16cex w16sdtdh w16sdtfl w16du wp14">
+<w:document xmlns:wpc="http://schemas.microsoft.com/office/word/2010/wordprocessingCanvas" xmlns:cx="http://schemas.microsoft.com/office/drawing/2014/chartex" xmlns:cx1="http://schemas.microsoft.com/office/drawing/2015/9/8/chartex" xmlns:cx2="http://schemas.microsoft.com/office/drawing/2015/10/21/chartex" xmlns:cx3="http://schemas.microsoft.com/office/drawing/2016/5/9/chartex" xmlns:cx4="http://schemas.microsoft.com/office/drawing/2016/5/10/chartex" xmlns:cx5="http://schemas.microsoft.com/office/drawing/2016/5/11/chartex" xmlns:cx6="http://schemas.microsoft.com/office/drawing/2016/5/12/chartex" xmlns:cx7="http://schemas.microsoft.com/office/drawing/2016/5/13/chartex" xmlns:cx8="http://schemas.microsoft.com/office/drawing/2016/5/14/chartex" xmlns:mc="http://schemas.openxmlformats.org/markup-compatibility/2006" xmlns:m="http://schemas.openxmlformats.org/officeDocument/2006/math" xmlns:aink="http://schemas.microsoft.com/office/drawing/2016/ink" xmlns:am3d="http://schemas.microsoft.com/office/drawing/2017/model3d" xmlns:oel="http://schemas.microsoft.com/office/2019/extlst" xmlns:r="http://schemas.openxmlformats.org/officeDocument/2006/relationships" xmlns:wp14="http://schemas.microsoft.com/office/word/2010/wordprocessingDrawing" xmlns:wp="http://schemas.openxmlformats.org/drawingml/2006/wordprocessingDrawing" xmlns:wpg="http://schemas.microsoft.com/office/word/2010/wordprocessingGroup" xmlns:wpi="http://schemas.microsoft.com/office/word/2010/wordprocessingInk" xmlns:wps="http://schemas.microsoft.com/office/word/2010/wordprocessingShape" xmlns:o="urn:schemas-microsoft-com:office:office" xmlns:v="urn:schemas-microsoft-com:vml" xmlns:w10="urn:schemas-microsoft-com:office:word" xmlns:w="http://schemas.openxmlformats.org/wordprocessingml/2006/main" xmlns:w14="http://schemas.microsoft.com/office/word/2010/wordml" xmlns:w15="http://schemas.microsoft.com/office/word/2012/wordml" xmlns:w16cei="http://schemas.microsoft.com/office/word/2026/wordml/cei" xmlns:w16cex="http://schemas.microsoft.com/office/word/2018/wordml/cex" xmlns:w16cid="http://schemas.microsoft.com/office/word/2016/wordml/cid" xmlns:w16="http://schemas.microsoft.com/office/word/2018/wordml" xmlns:w16sdtdh="http://schemas.microsoft.com/office/word/2020/wordml/sdtdatahash" xmlns:w16sdtfl="http://schemas.microsoft.com/office/word/2024/wordml/sdtformatlock" xmlns:w16se="http://schemas.microsoft.com/office/word/2015/wordml/symex" xmlns:w16du="http://schemas.microsoft.com/office/word/2023/wordml/word16du" xmlns:wne="http://schemas.microsoft.com/office/word/2006/wordml" mc:Ignorable="w14 w15 w16se w16cid w16 w16cex w16sdtdh w16sdtfl w16du wp14">
   <w:body>
     <w:p/>
     <w:sectPr>
@@ -21,7 +21,7 @@
 </file>
 
 <file path=word/endnotes.xml><?xml version="1.0" encoding="utf-8"?>
-<w:endnotes xmlns:wpc="http://schemas.microsoft.com/office/word/2010/wordprocessingCanvas" xmlns:cx="http://schemas.microsoft.com/office/drawing/2014/chartex" xmlns:cx1="http://schemas.microsoft.com/office/drawing/2015/9/8/chartex" xmlns:cx2="http://schemas.microsoft.com/office/drawing/2015/10/21/chartex" xmlns:cx3="http://schemas.microsoft.com/office/drawing/2016/5/9/chartex" xmlns:cx4="http://schemas.microsoft.com/office/drawing/2016/5/10/chartex" xmlns:cx5="http://schemas.microsoft.com/office/drawing/2016/5/11/chartex" xmlns:cx6="http://schemas.microsoft.com/office/drawing/2016/5/12/chartex" xmlns:cx7="http://schemas.microsoft.com/office/drawing/2016/5/13/chartex" xmlns:cx8="http://schemas.microsoft.com/office/drawing/2016/5/14/chartex" xmlns:mc="http://schemas.openxmlformats.org/markup-compatibility/2006" xmlns:aink="http://schemas.microsoft.com/office/drawing/2016/ink" xmlns:am3d="http://schemas.microsoft.com/office/drawing/2017/model3d" xmlns:o="urn:schemas-microsoft-com:office:office" xmlns:oel="http://schemas.microsoft.com/office/2019/extlst" xmlns:r="http://schemas.openxmlformats.org/officeDocument/2006/relationships" xmlns:m="http://schemas.openxmlformats.org/officeDocument/2006/math" xmlns:v="urn:schemas-microsoft-com:vml" xmlns:wp14="http://schemas.microsoft.com/office/word/2010/wordprocessingDrawing" xmlns:wp="http://schemas.openxmlformats.org/drawingml/2006/wordprocessingDrawing" xmlns:w10="urn:schemas-microsoft-com:office:word" xmlns:w="http://schemas.openxmlformats.org/wordprocessingml/2006/main" xmlns:w14="http://schemas.microsoft.com/office/word/2010/wordml" xmlns:w15="http://schemas.microsoft.com/office/word/2012/wordml" xmlns:w16cex="http://schemas.microsoft.com/office/word/2018/wordml/cex" xmlns:w16cid="http://schemas.microsoft.com/office/word/2016/wordml/cid" xmlns:w16="http://schemas.microsoft.com/office/word/2018/wordml" xmlns:w16du="http://schemas.microsoft.com/office/word/2023/wordml/word16du" xmlns:w16sdtdh="http://schemas.microsoft.com/office/word/2020/wordml/sdtdatahash" xmlns:w16sdtfl="http://schemas.microsoft.com/office/word/2024/wordml/sdtformatlock" xmlns:w16se="http://schemas.microsoft.com/office/word/2015/wordml/symex" xmlns:wpg="http://schemas.microsoft.com/office/word/2010/wordprocessingGroup" xmlns:wpi="http://schemas.microsoft.com/office/word/2010/wordprocessingInk" xmlns:wne="http://schemas.microsoft.com/office/word/2006/wordml" xmlns:wps="http://schemas.microsoft.com/office/word/2010/wordprocessingShape" mc:Ignorable="w14 w15 w16se w16cid w16 w16cex w16sdtdh w16sdtfl w16du wp14">
+<w:endnotes xmlns:wpc="http://schemas.microsoft.com/office/word/2010/wordprocessingCanvas" xmlns:cx="http://schemas.microsoft.com/office/drawing/2014/chartex" xmlns:cx1="http://schemas.microsoft.com/office/drawing/2015/9/8/chartex" xmlns:cx2="http://schemas.microsoft.com/office/drawing/2015/10/21/chartex" xmlns:cx3="http://schemas.microsoft.com/office/drawing/2016/5/9/chartex" xmlns:cx4="http://schemas.microsoft.com/office/drawing/2016/5/10/chartex" xmlns:cx5="http://schemas.microsoft.com/office/drawing/2016/5/11/chartex" xmlns:cx6="http://schemas.microsoft.com/office/drawing/2016/5/12/chartex" xmlns:cx7="http://schemas.microsoft.com/office/drawing/2016/5/13/chartex" xmlns:cx8="http://schemas.microsoft.com/office/drawing/2016/5/14/chartex" xmlns:mc="http://schemas.openxmlformats.org/markup-compatibility/2006" xmlns:m="http://schemas.openxmlformats.org/officeDocument/2006/math" xmlns:aink="http://schemas.microsoft.com/office/drawing/2016/ink" xmlns:am3d="http://schemas.microsoft.com/office/drawing/2017/model3d" xmlns:oel="http://schemas.microsoft.com/office/2019/extlst" xmlns:r="http://schemas.openxmlformats.org/officeDocument/2006/relationships" xmlns:wp14="http://schemas.microsoft.com/office/word/2010/wordprocessingDrawing" xmlns:wp="http://schemas.openxmlformats.org/drawingml/2006/wordprocessingDrawing" xmlns:wpg="http://schemas.microsoft.com/office/word/2010/wordprocessingGroup" xmlns:wpi="http://schemas.microsoft.com/office/word/2010/wordprocessingInk" xmlns:wps="http://schemas.microsoft.com/office/word/2010/wordprocessingShape" xmlns:o="urn:schemas-microsoft-com:office:office" xmlns:v="urn:schemas-microsoft-com:vml" xmlns:w10="urn:schemas-microsoft-com:office:word" xmlns:w="http://schemas.openxmlformats.org/wordprocessingml/2006/main" xmlns:w14="http://schemas.microsoft.com/office/word/2010/wordml" xmlns:w15="http://schemas.microsoft.com/office/word/2012/wordml" xmlns:w16cei="http://schemas.microsoft.com/office/word/2026/wordml/cei" xmlns:w16cex="http://schemas.microsoft.com/office/word/2018/wordml/cex" xmlns:w16cid="http://schemas.microsoft.com/office/word/2016/wordml/cid" xmlns:w16="http://schemas.microsoft.com/office/word/2018/wordml" xmlns:w16sdtdh="http://schemas.microsoft.com/office/word/2020/wordml/sdtdatahash" xmlns:w16sdtfl="http://schemas.microsoft.com/office/word/2024/wordml/sdtformatlock" xmlns:w16se="http://schemas.microsoft.com/office/word/2015/wordml/symex" xmlns:w16du="http://schemas.microsoft.com/office/word/2023/wordml/word16du" xmlns:wne="http://schemas.microsoft.com/office/word/2006/wordml" mc:Ignorable="w14 w15 w16se w16cid w16 w16cex w16sdtdh w16sdtfl w16du wp14">
   <w:endnote w:type="separator" w:id="-1">
     <w:p>
       <w:pPr>
@@ -53,7 +53,7 @@
 </file>
 
 <file path=word/footer1.xml><?xml version="1.0" encoding="utf-8"?>
-<w:ftr xmlns:wpc="http://schemas.microsoft.com/office/word/2010/wordprocessingCanvas" xmlns:cx="http://schemas.microsoft.com/office/drawing/2014/chartex" xmlns:cx1="http://schemas.microsoft.com/office/drawing/2015/9/8/chartex" xmlns:cx2="http://schemas.microsoft.com/office/drawing/2015/10/21/chartex" xmlns:cx3="http://schemas.microsoft.com/office/drawing/2016/5/9/chartex" xmlns:cx4="http://schemas.microsoft.com/office/drawing/2016/5/10/chartex" xmlns:cx5="http://schemas.microsoft.com/office/drawing/2016/5/11/chartex" xmlns:cx6="http://schemas.microsoft.com/office/drawing/2016/5/12/chartex" xmlns:cx7="http://schemas.microsoft.com/office/drawing/2016/5/13/chartex" xmlns:cx8="http://schemas.microsoft.com/office/drawing/2016/5/14/chartex" xmlns:mc="http://schemas.openxmlformats.org/markup-compatibility/2006" xmlns:aink="http://schemas.microsoft.com/office/drawing/2016/ink" xmlns:am3d="http://schemas.microsoft.com/office/drawing/2017/model3d" xmlns:o="urn:schemas-microsoft-com:office:office" xmlns:oel="http://schemas.microsoft.com/office/2019/extlst" xmlns:r="http://schemas.openxmlformats.org/officeDocument/2006/relationships" xmlns:m="http://schemas.openxmlformats.org/officeDocument/2006/math" xmlns:v="urn:schemas-microsoft-com:vml" xmlns:wp14="http://schemas.microsoft.com/office/word/2010/wordprocessingDrawing" xmlns:wp="http://schemas.openxmlformats.org/drawingml/2006/wordprocessingDrawing" xmlns:w10="urn:schemas-microsoft-com:office:word" xmlns:w="http://schemas.openxmlformats.org/wordprocessingml/2006/main" xmlns:w14="http://schemas.microsoft.com/office/word/2010/wordml" xmlns:w15="http://schemas.microsoft.com/office/word/2012/wordml" xmlns:w16cex="http://schemas.microsoft.com/office/word/2018/wordml/cex" xmlns:w16cid="http://schemas.microsoft.com/office/word/2016/wordml/cid" xmlns:w16="http://schemas.microsoft.com/office/word/2018/wordml" xmlns:w16du="http://schemas.microsoft.com/office/word/2023/wordml/word16du" xmlns:w16sdtdh="http://schemas.microsoft.com/office/word/2020/wordml/sdtdatahash" xmlns:w16sdtfl="http://schemas.microsoft.com/office/word/2024/wordml/sdtformatlock" xmlns:w16se="http://schemas.microsoft.com/office/word/2015/wordml/symex" xmlns:wpg="http://schemas.microsoft.com/office/word/2010/wordprocessingGroup" xmlns:wpi="http://schemas.microsoft.com/office/word/2010/wordprocessingInk" xmlns:wne="http://schemas.microsoft.com/office/word/2006/wordml" xmlns:wps="http://schemas.microsoft.com/office/word/2010/wordprocessingShape" mc:Ignorable="w14 w15 w16se w16cid w16 w16cex w16sdtdh w16sdtfl w16du wp14">
+<w:ftr xmlns:wpc="http://schemas.microsoft.com/office/word/2010/wordprocessingCanvas" xmlns:cx="http://schemas.microsoft.com/office/drawing/2014/chartex" xmlns:cx1="http://schemas.microsoft.com/office/drawing/2015/9/8/chartex" xmlns:cx2="http://schemas.microsoft.com/office/drawing/2015/10/21/chartex" xmlns:cx3="http://schemas.microsoft.com/office/drawing/2016/5/9/chartex" xmlns:cx4="http://schemas.microsoft.com/office/drawing/2016/5/10/chartex" xmlns:cx5="http://schemas.microsoft.com/office/drawing/2016/5/11/chartex" xmlns:cx6="http://schemas.microsoft.com/office/drawing/2016/5/12/chartex" xmlns:cx7="http://schemas.microsoft.com/office/drawing/2016/5/13/chartex" xmlns:cx8="http://schemas.microsoft.com/office/drawing/2016/5/14/chartex" xmlns:mc="http://schemas.openxmlformats.org/markup-compatibility/2006" xmlns:m="http://schemas.openxmlformats.org/officeDocument/2006/math" xmlns:aink="http://schemas.microsoft.com/office/drawing/2016/ink" xmlns:am3d="http://schemas.microsoft.com/office/drawing/2017/model3d" xmlns:oel="http://schemas.microsoft.com/office/2019/extlst" xmlns:r="http://schemas.openxmlformats.org/officeDocument/2006/relationships" xmlns:wp14="http://schemas.microsoft.com/office/word/2010/wordprocessingDrawing" xmlns:wp="http://schemas.openxmlformats.org/drawingml/2006/wordprocessingDrawing" xmlns:wpg="http://schemas.microsoft.com/office/word/2010/wordprocessingGroup" xmlns:wpi="http://schemas.microsoft.com/office/word/2010/wordprocessingInk" xmlns:wps="http://schemas.microsoft.com/office/word/2010/wordprocessingShape" xmlns:o="urn:schemas-microsoft-com:office:office" xmlns:v="urn:schemas-microsoft-com:vml" xmlns:w10="urn:schemas-microsoft-com:office:word" xmlns:w="http://schemas.openxmlformats.org/wordprocessingml/2006/main" xmlns:w14="http://schemas.microsoft.com/office/word/2010/wordml" xmlns:w15="http://schemas.microsoft.com/office/word/2012/wordml" xmlns:w16cei="http://schemas.microsoft.com/office/word/2026/wordml/cei" xmlns:w16cex="http://schemas.microsoft.com/office/word/2018/wordml/cex" xmlns:w16cid="http://schemas.microsoft.com/office/word/2016/wordml/cid" xmlns:w16="http://schemas.microsoft.com/office/word/2018/wordml" xmlns:w16sdtdh="http://schemas.microsoft.com/office/word/2020/wordml/sdtdatahash" xmlns:w16sdtfl="http://schemas.microsoft.com/office/word/2024/wordml/sdtformatlock" xmlns:w16se="http://schemas.microsoft.com/office/word/2015/wordml/symex" xmlns:w16du="http://schemas.microsoft.com/office/word/2023/wordml/word16du" xmlns:wne="http://schemas.microsoft.com/office/word/2006/wordml" mc:Ignorable="w14 w15 w16se w16cid w16 w16cex w16sdtdh w16sdtfl w16du wp14">
   <w:p>
     <w:pPr>
       <w:pStyle w:val="Footer"/>
@@ -63,7 +63,7 @@
 </file>
 
 <file path=word/footer2.xml><?xml version="1.0" encoding="utf-8"?>
-<w:ftr xmlns:wpc="http://schemas.microsoft.com/office/word/2010/wordprocessingCanvas" xmlns:cx="http://schemas.microsoft.com/office/drawing/2014/chartex" xmlns:cx1="http://schemas.microsoft.com/office/drawing/2015/9/8/chartex" xmlns:cx2="http://schemas.microsoft.com/office/drawing/2015/10/21/chartex" xmlns:cx3="http://schemas.microsoft.com/office/drawing/2016/5/9/chartex" xmlns:cx4="http://schemas.microsoft.com/office/drawing/2016/5/10/chartex" xmlns:cx5="http://schemas.microsoft.com/office/drawing/2016/5/11/chartex" xmlns:cx6="http://schemas.microsoft.com/office/drawing/2016/5/12/chartex" xmlns:cx7="http://schemas.microsoft.com/office/drawing/2016/5/13/chartex" xmlns:cx8="http://schemas.microsoft.com/office/drawing/2016/5/14/chartex" xmlns:mc="http://schemas.openxmlformats.org/markup-compatibility/2006" xmlns:aink="http://schemas.microsoft.com/office/drawing/2016/ink" xmlns:am3d="http://schemas.microsoft.com/office/drawing/2017/model3d" xmlns:o="urn:schemas-microsoft-com:office:office" xmlns:oel="http://schemas.microsoft.com/office/2019/extlst" xmlns:r="http://schemas.openxmlformats.org/officeDocument/2006/relationships" xmlns:m="http://schemas.openxmlformats.org/officeDocument/2006/math" xmlns:v="urn:schemas-microsoft-com:vml" xmlns:wp14="http://schemas.microsoft.com/office/word/2010/wordprocessingDrawing" xmlns:wp="http://schemas.openxmlformats.org/drawingml/2006/wordprocessingDrawing" xmlns:w10="urn:schemas-microsoft-com:office:word" xmlns:w="http://schemas.openxmlformats.org/wordprocessingml/2006/main" xmlns:w14="http://schemas.microsoft.com/office/word/2010/wordml" xmlns:w15="http://schemas.microsoft.com/office/word/2012/wordml" xmlns:w16cex="http://schemas.microsoft.com/office/word/2018/wordml/cex" xmlns:w16cid="http://schemas.microsoft.com/office/word/2016/wordml/cid" xmlns:w16="http://schemas.microsoft.com/office/word/2018/wordml" xmlns:w16du="http://schemas.microsoft.com/office/word/2023/wordml/word16du" xmlns:w16sdtdh="http://schemas.microsoft.com/office/word/2020/wordml/sdtdatahash" xmlns:w16sdtfl="http://schemas.microsoft.com/office/word/2024/wordml/sdtformatlock" xmlns:w16se="http://schemas.microsoft.com/office/word/2015/wordml/symex" xmlns:wpg="http://schemas.microsoft.com/office/word/2010/wordprocessingGroup" xmlns:wpi="http://schemas.microsoft.com/office/word/2010/wordprocessingInk" xmlns:wne="http://schemas.microsoft.com/office/word/2006/wordml" xmlns:wps="http://schemas.microsoft.com/office/word/2010/wordprocessingShape" mc:Ignorable="w14 w15 w16se w16cid w16 w16cex w16sdtdh w16sdtfl w16du wp14">
+<w:ftr xmlns:wpc="http://schemas.microsoft.com/office/word/2010/wordprocessingCanvas" xmlns:cx="http://schemas.microsoft.com/office/drawing/2014/chartex" xmlns:cx1="http://schemas.microsoft.com/office/drawing/2015/9/8/chartex" xmlns:cx2="http://schemas.microsoft.com/office/drawing/2015/10/21/chartex" xmlns:cx3="http://schemas.microsoft.com/office/drawing/2016/5/9/chartex" xmlns:cx4="http://schemas.microsoft.com/office/drawing/2016/5/10/chartex" xmlns:cx5="http://schemas.microsoft.com/office/drawing/2016/5/11/chartex" xmlns:cx6="http://schemas.microsoft.com/office/drawing/2016/5/12/chartex" xmlns:cx7="http://schemas.microsoft.com/office/drawing/2016/5/13/chartex" xmlns:cx8="http://schemas.microsoft.com/office/drawing/2016/5/14/chartex" xmlns:mc="http://schemas.openxmlformats.org/markup-compatibility/2006" xmlns:m="http://schemas.openxmlformats.org/officeDocument/2006/math" xmlns:aink="http://schemas.microsoft.com/office/drawing/2016/ink" xmlns:am3d="http://schemas.microsoft.com/office/drawing/2017/model3d" xmlns:oel="http://schemas.microsoft.com/office/2019/extlst" xmlns:r="http://schemas.openxmlformats.org/officeDocument/2006/relationships" xmlns:wp14="http://schemas.microsoft.com/office/word/2010/wordprocessingDrawing" xmlns:wp="http://schemas.openxmlformats.org/drawingml/2006/wordprocessingDrawing" xmlns:wpg="http://schemas.microsoft.com/office/word/2010/wordprocessingGroup" xmlns:wpi="http://schemas.microsoft.com/office/word/2010/wordprocessingInk" xmlns:wps="http://schemas.microsoft.com/office/word/2010/wordprocessingShape" xmlns:o="urn:schemas-microsoft-com:office:office" xmlns:v="urn:schemas-microsoft-com:vml" xmlns:w10="urn:schemas-microsoft-com:office:word" xmlns:w="http://schemas.openxmlformats.org/wordprocessingml/2006/main" xmlns:w14="http://schemas.microsoft.com/office/word/2010/wordml" xmlns:w15="http://schemas.microsoft.com/office/word/2012/wordml" xmlns:w16cei="http://schemas.microsoft.com/office/word/2026/wordml/cei" xmlns:w16cex="http://schemas.microsoft.com/office/word/2018/wordml/cex" xmlns:w16cid="http://schemas.microsoft.com/office/word/2016/wordml/cid" xmlns:w16="http://schemas.microsoft.com/office/word/2018/wordml" xmlns:w16sdtdh="http://schemas.microsoft.com/office/word/2020/wordml/sdtdatahash" xmlns:w16sdtfl="http://schemas.microsoft.com/office/word/2024/wordml/sdtformatlock" xmlns:w16se="http://schemas.microsoft.com/office/word/2015/wordml/symex" xmlns:w16du="http://schemas.microsoft.com/office/word/2023/wordml/word16du" xmlns:wne="http://schemas.microsoft.com/office/word/2006/wordml" mc:Ignorable="w14 w15 w16se w16cid w16 w16cex w16sdtdh w16sdtfl w16du wp14">
   <w:p>
     <w:pPr>
       <w:pStyle w:val="Footer"/>
@@ -86,7 +86,7 @@
         <w:noProof/>
       </w:rPr>
       <w:drawing>
-        <wp:inline distT="0" distB="0" distL="0" distR="0" wp14:anchorId="031AA4D1" wp14:editId="3031852C">
+        <wp:inline distT="0" distB="0" distL="0" distR="0" wp14:anchorId="031AA4D1" wp14:editId="66218F14">
           <wp:extent cx="9182100" cy="381000"/>
           <wp:effectExtent l="0" t="0" r="0" b="0"/>
           <wp:docPr id="1" name="Picture 1780135132"/>
@@ -97,7 +97,7 @@
             <a:graphicData uri="http://schemas.openxmlformats.org/drawingml/2006/picture">
               <pic:pic xmlns:pic="http://schemas.openxmlformats.org/drawingml/2006/picture">
                 <pic:nvPicPr>
-                  <pic:cNvPr id="0" name="Picture 1780135132"/>
+                  <pic:cNvPr id="1" name="Picture 1780135132"/>
                   <pic:cNvPicPr>
                     <a:picLocks/>
                   </pic:cNvPicPr>
@@ -110,7 +110,7 @@
                       </a:ext>
                     </a:extLst>
                   </a:blip>
-                  <a:srcRect t="18056" b="19800"/>
+                  <a:srcRect t="207" b="207"/>
                   <a:stretch>
                     <a:fillRect/>
                   </a:stretch>
@@ -139,7 +139,7 @@
 </file>
 
 <file path=word/footer3.xml><?xml version="1.0" encoding="utf-8"?>
-<w:ftr xmlns:wpc="http://schemas.microsoft.com/office/word/2010/wordprocessingCanvas" xmlns:cx="http://schemas.microsoft.com/office/drawing/2014/chartex" xmlns:cx1="http://schemas.microsoft.com/office/drawing/2015/9/8/chartex" xmlns:cx2="http://schemas.microsoft.com/office/drawing/2015/10/21/chartex" xmlns:cx3="http://schemas.microsoft.com/office/drawing/2016/5/9/chartex" xmlns:cx4="http://schemas.microsoft.com/office/drawing/2016/5/10/chartex" xmlns:cx5="http://schemas.microsoft.com/office/drawing/2016/5/11/chartex" xmlns:cx6="http://schemas.microsoft.com/office/drawing/2016/5/12/chartex" xmlns:cx7="http://schemas.microsoft.com/office/drawing/2016/5/13/chartex" xmlns:cx8="http://schemas.microsoft.com/office/drawing/2016/5/14/chartex" xmlns:mc="http://schemas.openxmlformats.org/markup-compatibility/2006" xmlns:aink="http://schemas.microsoft.com/office/drawing/2016/ink" xmlns:am3d="http://schemas.microsoft.com/office/drawing/2017/model3d" xmlns:o="urn:schemas-microsoft-com:office:office" xmlns:oel="http://schemas.microsoft.com/office/2019/extlst" xmlns:r="http://schemas.openxmlformats.org/officeDocument/2006/relationships" xmlns:m="http://schemas.openxmlformats.org/officeDocument/2006/math" xmlns:v="urn:schemas-microsoft-com:vml" xmlns:wp14="http://schemas.microsoft.com/office/word/2010/wordprocessingDrawing" xmlns:wp="http://schemas.openxmlformats.org/drawingml/2006/wordprocessingDrawing" xmlns:w10="urn:schemas-microsoft-com:office:word" xmlns:w="http://schemas.openxmlformats.org/wordprocessingml/2006/main" xmlns:w14="http://schemas.microsoft.com/office/word/2010/wordml" xmlns:w15="http://schemas.microsoft.com/office/word/2012/wordml" xmlns:w16cex="http://schemas.microsoft.com/office/word/2018/wordml/cex" xmlns:w16cid="http://schemas.microsoft.com/office/word/2016/wordml/cid" xmlns:w16="http://schemas.microsoft.com/office/word/2018/wordml" xmlns:w16du="http://schemas.microsoft.com/office/word/2023/wordml/word16du" xmlns:w16sdtdh="http://schemas.microsoft.com/office/word/2020/wordml/sdtdatahash" xmlns:w16sdtfl="http://schemas.microsoft.com/office/word/2024/wordml/sdtformatlock" xmlns:w16se="http://schemas.microsoft.com/office/word/2015/wordml/symex" xmlns:wpg="http://schemas.microsoft.com/office/word/2010/wordprocessingGroup" xmlns:wpi="http://schemas.microsoft.com/office/word/2010/wordprocessingInk" xmlns:wne="http://schemas.microsoft.com/office/word/2006/wordml" xmlns:wps="http://schemas.microsoft.com/office/word/2010/wordprocessingShape" mc:Ignorable="w14 w15 w16se w16cid w16 w16cex w16sdtdh w16sdtfl w16du wp14">
+<w:ftr xmlns:wpc="http://schemas.microsoft.com/office/word/2010/wordprocessingCanvas" xmlns:cx="http://schemas.microsoft.com/office/drawing/2014/chartex" xmlns:cx1="http://schemas.microsoft.com/office/drawing/2015/9/8/chartex" xmlns:cx2="http://schemas.microsoft.com/office/drawing/2015/10/21/chartex" xmlns:cx3="http://schemas.microsoft.com/office/drawing/2016/5/9/chartex" xmlns:cx4="http://schemas.microsoft.com/office/drawing/2016/5/10/chartex" xmlns:cx5="http://schemas.microsoft.com/office/drawing/2016/5/11/chartex" xmlns:cx6="http://schemas.microsoft.com/office/drawing/2016/5/12/chartex" xmlns:cx7="http://schemas.microsoft.com/office/drawing/2016/5/13/chartex" xmlns:cx8="http://schemas.microsoft.com/office/drawing/2016/5/14/chartex" xmlns:mc="http://schemas.openxmlformats.org/markup-compatibility/2006" xmlns:m="http://schemas.openxmlformats.org/officeDocument/2006/math" xmlns:aink="http://schemas.microsoft.com/office/drawing/2016/ink" xmlns:am3d="http://schemas.microsoft.com/office/drawing/2017/model3d" xmlns:oel="http://schemas.microsoft.com/office/2019/extlst" xmlns:r="http://schemas.openxmlformats.org/officeDocument/2006/relationships" xmlns:wp14="http://schemas.microsoft.com/office/word/2010/wordprocessingDrawing" xmlns:wp="http://schemas.openxmlformats.org/drawingml/2006/wordprocessingDrawing" xmlns:wpg="http://schemas.microsoft.com/office/word/2010/wordprocessingGroup" xmlns:wpi="http://schemas.microsoft.com/office/word/2010/wordprocessingInk" xmlns:wps="http://schemas.microsoft.com/office/word/2010/wordprocessingShape" xmlns:o="urn:schemas-microsoft-com:office:office" xmlns:v="urn:schemas-microsoft-com:vml" xmlns:w10="urn:schemas-microsoft-com:office:word" xmlns:w="http://schemas.openxmlformats.org/wordprocessingml/2006/main" xmlns:w14="http://schemas.microsoft.com/office/word/2010/wordml" xmlns:w15="http://schemas.microsoft.com/office/word/2012/wordml" xmlns:w16cei="http://schemas.microsoft.com/office/word/2026/wordml/cei" xmlns:w16cex="http://schemas.microsoft.com/office/word/2018/wordml/cex" xmlns:w16cid="http://schemas.microsoft.com/office/word/2016/wordml/cid" xmlns:w16="http://schemas.microsoft.com/office/word/2018/wordml" xmlns:w16sdtdh="http://schemas.microsoft.com/office/word/2020/wordml/sdtdatahash" xmlns:w16sdtfl="http://schemas.microsoft.com/office/word/2024/wordml/sdtformatlock" xmlns:w16se="http://schemas.microsoft.com/office/word/2015/wordml/symex" xmlns:w16du="http://schemas.microsoft.com/office/word/2023/wordml/word16du" xmlns:wne="http://schemas.microsoft.com/office/word/2006/wordml" mc:Ignorable="w14 w15 w16se w16cid w16 w16cex w16sdtdh w16sdtfl w16du wp14">
   <w:p>
     <w:pPr>
       <w:pStyle w:val="Footer"/>
@@ -215,7 +215,7 @@
 </file>
 
 <file path=word/footnotes.xml><?xml version="1.0" encoding="utf-8"?>
-<w:footnotes xmlns:wpc="http://schemas.microsoft.com/office/word/2010/wordprocessingCanvas" xmlns:cx="http://schemas.microsoft.com/office/drawing/2014/chartex" xmlns:cx1="http://schemas.microsoft.com/office/drawing/2015/9/8/chartex" xmlns:cx2="http://schemas.microsoft.com/office/drawing/2015/10/21/chartex" xmlns:cx3="http://schemas.microsoft.com/office/drawing/2016/5/9/chartex" xmlns:cx4="http://schemas.microsoft.com/office/drawing/2016/5/10/chartex" xmlns:cx5="http://schemas.microsoft.com/office/drawing/2016/5/11/chartex" xmlns:cx6="http://schemas.microsoft.com/office/drawing/2016/5/12/chartex" xmlns:cx7="http://schemas.microsoft.com/office/drawing/2016/5/13/chartex" xmlns:cx8="http://schemas.microsoft.com/office/drawing/2016/5/14/chartex" xmlns:mc="http://schemas.openxmlformats.org/markup-compatibility/2006" xmlns:aink="http://schemas.microsoft.com/office/drawing/2016/ink" xmlns:am3d="http://schemas.microsoft.com/office/drawing/2017/model3d" xmlns:o="urn:schemas-microsoft-com:office:office" xmlns:oel="http://schemas.microsoft.com/office/2019/extlst" xmlns:r="http://schemas.openxmlformats.org/officeDocument/2006/relationships" xmlns:m="http://schemas.openxmlformats.org/officeDocument/2006/math" xmlns:v="urn:schemas-microsoft-com:vml" xmlns:wp14="http://schemas.microsoft.com/office/word/2010/wordprocessingDrawing" xmlns:wp="http://schemas.openxmlformats.org/drawingml/2006/wordprocessingDrawing" xmlns:w10="urn:schemas-microsoft-com:office:word" xmlns:w="http://schemas.openxmlformats.org/wordprocessingml/2006/main" xmlns:w14="http://schemas.microsoft.com/office/word/2010/wordml" xmlns:w15="http://schemas.microsoft.com/office/word/2012/wordml" xmlns:w16cex="http://schemas.microsoft.com/office/word/2018/wordml/cex" xmlns:w16cid="http://schemas.microsoft.com/office/word/2016/wordml/cid" xmlns:w16="http://schemas.microsoft.com/office/word/2018/wordml" xmlns:w16du="http://schemas.microsoft.com/office/word/2023/wordml/word16du" xmlns:w16sdtdh="http://schemas.microsoft.com/office/word/2020/wordml/sdtdatahash" xmlns:w16sdtfl="http://schemas.microsoft.com/office/word/2024/wordml/sdtformatlock" xmlns:w16se="http://schemas.microsoft.com/office/word/2015/wordml/symex" xmlns:wpg="http://schemas.microsoft.com/office/word/2010/wordprocessingGroup" xmlns:wpi="http://schemas.microsoft.com/office/word/2010/wordprocessingInk" xmlns:wne="http://schemas.microsoft.com/office/word/2006/wordml" xmlns:wps="http://schemas.microsoft.com/office/word/2010/wordprocessingShape" mc:Ignorable="w14 w15 w16se w16cid w16 w16cex w16sdtdh w16sdtfl w16du wp14">
+<w:footnotes xmlns:wpc="http://schemas.microsoft.com/office/word/2010/wordprocessingCanvas" xmlns:cx="http://schemas.microsoft.com/office/drawing/2014/chartex" xmlns:cx1="http://schemas.microsoft.com/office/drawing/2015/9/8/chartex" xmlns:cx2="http://schemas.microsoft.com/office/drawing/2015/10/21/chartex" xmlns:cx3="http://schemas.microsoft.com/office/drawing/2016/5/9/chartex" xmlns:cx4="http://schemas.microsoft.com/office/drawing/2016/5/10/chartex" xmlns:cx5="http://schemas.microsoft.com/office/drawing/2016/5/11/chartex" xmlns:cx6="http://schemas.microsoft.com/office/drawing/2016/5/12/chartex" xmlns:cx7="http://schemas.microsoft.com/office/drawing/2016/5/13/chartex" xmlns:cx8="http://schemas.microsoft.com/office/drawing/2016/5/14/chartex" xmlns:mc="http://schemas.openxmlformats.org/markup-compatibility/2006" xmlns:m="http://schemas.openxmlformats.org/officeDocument/2006/math" xmlns:aink="http://schemas.microsoft.com/office/drawing/2016/ink" xmlns:am3d="http://schemas.microsoft.com/office/drawing/2017/model3d" xmlns:oel="http://schemas.microsoft.com/office/2019/extlst" xmlns:r="http://schemas.openxmlformats.org/officeDocument/2006/relationships" xmlns:wp14="http://schemas.microsoft.com/office/word/2010/wordprocessingDrawing" xmlns:wp="http://schemas.openxmlformats.org/drawingml/2006/wordprocessingDrawing" xmlns:wpg="http://schemas.microsoft.com/office/word/2010/wordprocessingGroup" xmlns:wpi="http://schemas.microsoft.com/office/word/2010/wordprocessingInk" xmlns:wps="http://schemas.microsoft.com/office/word/2010/wordprocessingShape" xmlns:o="urn:schemas-microsoft-com:office:office" xmlns:v="urn:schemas-microsoft-com:vml" xmlns:w10="urn:schemas-microsoft-com:office:word" xmlns:w="http://schemas.openxmlformats.org/wordprocessingml/2006/main" xmlns:w14="http://schemas.microsoft.com/office/word/2010/wordml" xmlns:w15="http://schemas.microsoft.com/office/word/2012/wordml" xmlns:w16cei="http://schemas.microsoft.com/office/word/2026/wordml/cei" xmlns:w16cex="http://schemas.microsoft.com/office/word/2018/wordml/cex" xmlns:w16cid="http://schemas.microsoft.com/office/word/2016/wordml/cid" xmlns:w16="http://schemas.microsoft.com/office/word/2018/wordml" xmlns:w16sdtdh="http://schemas.microsoft.com/office/word/2020/wordml/sdtdatahash" xmlns:w16sdtfl="http://schemas.microsoft.com/office/word/2024/wordml/sdtformatlock" xmlns:w16se="http://schemas.microsoft.com/office/word/2015/wordml/symex" xmlns:w16du="http://schemas.microsoft.com/office/word/2023/wordml/word16du" xmlns:wne="http://schemas.microsoft.com/office/word/2006/wordml" mc:Ignorable="w14 w15 w16se w16cid w16 w16cex w16sdtdh w16sdtfl w16du wp14">
   <w:footnote w:type="separator" w:id="-1">
     <w:p>
       <w:pPr>
@@ -247,7 +247,7 @@
 </file>
 
 <file path=word/header1.xml><?xml version="1.0" encoding="utf-8"?>
-<w:hdr xmlns:wpc="http://schemas.microsoft.com/office/word/2010/wordprocessingCanvas" xmlns:cx="http://schemas.microsoft.com/office/drawing/2014/chartex" xmlns:cx1="http://schemas.microsoft.com/office/drawing/2015/9/8/chartex" xmlns:cx2="http://schemas.microsoft.com/office/drawing/2015/10/21/chartex" xmlns:cx3="http://schemas.microsoft.com/office/drawing/2016/5/9/chartex" xmlns:cx4="http://schemas.microsoft.com/office/drawing/2016/5/10/chartex" xmlns:cx5="http://schemas.microsoft.com/office/drawing/2016/5/11/chartex" xmlns:cx6="http://schemas.microsoft.com/office/drawing/2016/5/12/chartex" xmlns:cx7="http://schemas.microsoft.com/office/drawing/2016/5/13/chartex" xmlns:cx8="http://schemas.microsoft.com/office/drawing/2016/5/14/chartex" xmlns:mc="http://schemas.openxmlformats.org/markup-compatibility/2006" xmlns:aink="http://schemas.microsoft.com/office/drawing/2016/ink" xmlns:am3d="http://schemas.microsoft.com/office/drawing/2017/model3d" xmlns:o="urn:schemas-microsoft-com:office:office" xmlns:oel="http://schemas.microsoft.com/office/2019/extlst" xmlns:r="http://schemas.openxmlformats.org/officeDocument/2006/relationships" xmlns:m="http://schemas.openxmlformats.org/officeDocument/2006/math" xmlns:v="urn:schemas-microsoft-com:vml" xmlns:wp14="http://schemas.microsoft.com/office/word/2010/wordprocessingDrawing" xmlns:wp="http://schemas.openxmlformats.org/drawingml/2006/wordprocessingDrawing" xmlns:w10="urn:schemas-microsoft-com:office:word" xmlns:w="http://schemas.openxmlformats.org/wordprocessingml/2006/main" xmlns:w14="http://schemas.microsoft.com/office/word/2010/wordml" xmlns:w15="http://schemas.microsoft.com/office/word/2012/wordml" xmlns:w16cex="http://schemas.microsoft.com/office/word/2018/wordml/cex" xmlns:w16cid="http://schemas.microsoft.com/office/word/2016/wordml/cid" xmlns:w16="http://schemas.microsoft.com/office/word/2018/wordml" xmlns:w16du="http://schemas.microsoft.com/office/word/2023/wordml/word16du" xmlns:w16sdtdh="http://schemas.microsoft.com/office/word/2020/wordml/sdtdatahash" xmlns:w16sdtfl="http://schemas.microsoft.com/office/word/2024/wordml/sdtformatlock" xmlns:w16se="http://schemas.microsoft.com/office/word/2015/wordml/symex" xmlns:wpg="http://schemas.microsoft.com/office/word/2010/wordprocessingGroup" xmlns:wpi="http://schemas.microsoft.com/office/word/2010/wordprocessingInk" xmlns:wne="http://schemas.microsoft.com/office/word/2006/wordml" xmlns:wps="http://schemas.microsoft.com/office/word/2010/wordprocessingShape" mc:Ignorable="w14 w15 w16se w16cid w16 w16cex w16sdtdh w16sdtfl w16du wp14">
+<w:hdr xmlns:wpc="http://schemas.microsoft.com/office/word/2010/wordprocessingCanvas" xmlns:cx="http://schemas.microsoft.com/office/drawing/2014/chartex" xmlns:cx1="http://schemas.microsoft.com/office/drawing/2015/9/8/chartex" xmlns:cx2="http://schemas.microsoft.com/office/drawing/2015/10/21/chartex" xmlns:cx3="http://schemas.microsoft.com/office/drawing/2016/5/9/chartex" xmlns:cx4="http://schemas.microsoft.com/office/drawing/2016/5/10/chartex" xmlns:cx5="http://schemas.microsoft.com/office/drawing/2016/5/11/chartex" xmlns:cx6="http://schemas.microsoft.com/office/drawing/2016/5/12/chartex" xmlns:cx7="http://schemas.microsoft.com/office/drawing/2016/5/13/chartex" xmlns:cx8="http://schemas.microsoft.com/office/drawing/2016/5/14/chartex" xmlns:mc="http://schemas.openxmlformats.org/markup-compatibility/2006" xmlns:m="http://schemas.openxmlformats.org/officeDocument/2006/math" xmlns:aink="http://schemas.microsoft.com/office/drawing/2016/ink" xmlns:am3d="http://schemas.microsoft.com/office/drawing/2017/model3d" xmlns:oel="http://schemas.microsoft.com/office/2019/extlst" xmlns:r="http://schemas.openxmlformats.org/officeDocument/2006/relationships" xmlns:wp14="http://schemas.microsoft.com/office/word/2010/wordprocessingDrawing" xmlns:wp="http://schemas.openxmlformats.org/drawingml/2006/wordprocessingDrawing" xmlns:wpg="http://schemas.microsoft.com/office/word/2010/wordprocessingGroup" xmlns:wpi="http://schemas.microsoft.com/office/word/2010/wordprocessingInk" xmlns:wps="http://schemas.microsoft.com/office/word/2010/wordprocessingShape" xmlns:o="urn:schemas-microsoft-com:office:office" xmlns:v="urn:schemas-microsoft-com:vml" xmlns:w10="urn:schemas-microsoft-com:office:word" xmlns:w="http://schemas.openxmlformats.org/wordprocessingml/2006/main" xmlns:w14="http://schemas.microsoft.com/office/word/2010/wordml" xmlns:w15="http://schemas.microsoft.com/office/word/2012/wordml" xmlns:w16cei="http://schemas.microsoft.com/office/word/2026/wordml/cei" xmlns:w16cex="http://schemas.microsoft.com/office/word/2018/wordml/cex" xmlns:w16cid="http://schemas.microsoft.com/office/word/2016/wordml/cid" xmlns:w16="http://schemas.microsoft.com/office/word/2018/wordml" xmlns:w16sdtdh="http://schemas.microsoft.com/office/word/2020/wordml/sdtdatahash" xmlns:w16sdtfl="http://schemas.microsoft.com/office/word/2024/wordml/sdtformatlock" xmlns:w16se="http://schemas.microsoft.com/office/word/2015/wordml/symex" xmlns:w16du="http://schemas.microsoft.com/office/word/2023/wordml/word16du" xmlns:wne="http://schemas.microsoft.com/office/word/2006/wordml" mc:Ignorable="w14 w15 w16se w16cid w16 w16cex w16sdtdh w16sdtfl w16du wp14">
   <w:p>
     <w:pPr>
       <w:pStyle w:val="Header"/>
@@ -257,7 +257,7 @@
 </file>
 
 <file path=word/header2.xml><?xml version="1.0" encoding="utf-8"?>
-<w:hdr xmlns:wpc="http://schemas.microsoft.com/office/word/2010/wordprocessingCanvas" xmlns:cx="http://schemas.microsoft.com/office/drawing/2014/chartex" xmlns:cx1="http://schemas.microsoft.com/office/drawing/2015/9/8/chartex" xmlns:cx2="http://schemas.microsoft.com/office/drawing/2015/10/21/chartex" xmlns:cx3="http://schemas.microsoft.com/office/drawing/2016/5/9/chartex" xmlns:cx4="http://schemas.microsoft.com/office/drawing/2016/5/10/chartex" xmlns:cx5="http://schemas.microsoft.com/office/drawing/2016/5/11/chartex" xmlns:cx6="http://schemas.microsoft.com/office/drawing/2016/5/12/chartex" xmlns:cx7="http://schemas.microsoft.com/office/drawing/2016/5/13/chartex" xmlns:cx8="http://schemas.microsoft.com/office/drawing/2016/5/14/chartex" xmlns:mc="http://schemas.openxmlformats.org/markup-compatibility/2006" xmlns:aink="http://schemas.microsoft.com/office/drawing/2016/ink" xmlns:am3d="http://schemas.microsoft.com/office/drawing/2017/model3d" xmlns:o="urn:schemas-microsoft-com:office:office" xmlns:oel="http://schemas.microsoft.com/office/2019/extlst" xmlns:r="http://schemas.openxmlformats.org/officeDocument/2006/relationships" xmlns:m="http://schemas.openxmlformats.org/officeDocument/2006/math" xmlns:v="urn:schemas-microsoft-com:vml" xmlns:wp14="http://schemas.microsoft.com/office/word/2010/wordprocessingDrawing" xmlns:wp="http://schemas.openxmlformats.org/drawingml/2006/wordprocessingDrawing" xmlns:w10="urn:schemas-microsoft-com:office:word" xmlns:w="http://schemas.openxmlformats.org/wordprocessingml/2006/main" xmlns:w14="http://schemas.microsoft.com/office/word/2010/wordml" xmlns:w15="http://schemas.microsoft.com/office/word/2012/wordml" xmlns:w16cex="http://schemas.microsoft.com/office/word/2018/wordml/cex" xmlns:w16cid="http://schemas.microsoft.com/office/word/2016/wordml/cid" xmlns:w16="http://schemas.microsoft.com/office/word/2018/wordml" xmlns:w16du="http://schemas.microsoft.com/office/word/2023/wordml/word16du" xmlns:w16sdtdh="http://schemas.microsoft.com/office/word/2020/wordml/sdtdatahash" xmlns:w16sdtfl="http://schemas.microsoft.com/office/word/2024/wordml/sdtformatlock" xmlns:w16se="http://schemas.microsoft.com/office/word/2015/wordml/symex" xmlns:wpg="http://schemas.microsoft.com/office/word/2010/wordprocessingGroup" xmlns:wpi="http://schemas.microsoft.com/office/word/2010/wordprocessingInk" xmlns:wne="http://schemas.microsoft.com/office/word/2006/wordml" xmlns:wps="http://schemas.microsoft.com/office/word/2010/wordprocessingShape" mc:Ignorable="w14 w15 w16se w16cid w16 w16cex w16sdtdh w16sdtfl w16du wp14">
+<w:hdr xmlns:wpc="http://schemas.microsoft.com/office/word/2010/wordprocessingCanvas" xmlns:cx="http://schemas.microsoft.com/office/drawing/2014/chartex" xmlns:cx1="http://schemas.microsoft.com/office/drawing/2015/9/8/chartex" xmlns:cx2="http://schemas.microsoft.com/office/drawing/2015/10/21/chartex" xmlns:cx3="http://schemas.microsoft.com/office/drawing/2016/5/9/chartex" xmlns:cx4="http://schemas.microsoft.com/office/drawing/2016/5/10/chartex" xmlns:cx5="http://schemas.microsoft.com/office/drawing/2016/5/11/chartex" xmlns:cx6="http://schemas.microsoft.com/office/drawing/2016/5/12/chartex" xmlns:cx7="http://schemas.microsoft.com/office/drawing/2016/5/13/chartex" xmlns:cx8="http://schemas.microsoft.com/office/drawing/2016/5/14/chartex" xmlns:mc="http://schemas.openxmlformats.org/markup-compatibility/2006" xmlns:m="http://schemas.openxmlformats.org/officeDocument/2006/math" xmlns:aink="http://schemas.microsoft.com/office/drawing/2016/ink" xmlns:am3d="http://schemas.microsoft.com/office/drawing/2017/model3d" xmlns:oel="http://schemas.microsoft.com/office/2019/extlst" xmlns:r="http://schemas.openxmlformats.org/officeDocument/2006/relationships" xmlns:wp14="http://schemas.microsoft.com/office/word/2010/wordprocessingDrawing" xmlns:wp="http://schemas.openxmlformats.org/drawingml/2006/wordprocessingDrawing" xmlns:wpg="http://schemas.microsoft.com/office/word/2010/wordprocessingGroup" xmlns:wpi="http://schemas.microsoft.com/office/word/2010/wordprocessingInk" xmlns:wps="http://schemas.microsoft.com/office/word/2010/wordprocessingShape" xmlns:o="urn:schemas-microsoft-com:office:office" xmlns:v="urn:schemas-microsoft-com:vml" xmlns:w10="urn:schemas-microsoft-com:office:word" xmlns:w="http://schemas.openxmlformats.org/wordprocessingml/2006/main" xmlns:w14="http://schemas.microsoft.com/office/word/2010/wordml" xmlns:w15="http://schemas.microsoft.com/office/word/2012/wordml" xmlns:w16cei="http://schemas.microsoft.com/office/word/2026/wordml/cei" xmlns:w16cex="http://schemas.microsoft.com/office/word/2018/wordml/cex" xmlns:w16cid="http://schemas.microsoft.com/office/word/2016/wordml/cid" xmlns:w16="http://schemas.microsoft.com/office/word/2018/wordml" xmlns:w16sdtdh="http://schemas.microsoft.com/office/word/2020/wordml/sdtdatahash" xmlns:w16sdtfl="http://schemas.microsoft.com/office/word/2024/wordml/sdtformatlock" xmlns:w16se="http://schemas.microsoft.com/office/word/2015/wordml/symex" xmlns:w16du="http://schemas.microsoft.com/office/word/2023/wordml/word16du" xmlns:wne="http://schemas.microsoft.com/office/word/2006/wordml" mc:Ignorable="w14 w15 w16se w16cid w16 w16cex w16sdtdh w16sdtfl w16du wp14">
   <w:p>
     <w:pPr>
       <w:pStyle w:val="Header"/>
@@ -334,7 +334,7 @@
 </file>
 
 <file path=word/header3.xml><?xml version="1.0" encoding="utf-8"?>
-<w:hdr xmlns:wpc="http://schemas.microsoft.com/office/word/2010/wordprocessingCanvas" xmlns:cx="http://schemas.microsoft.com/office/drawing/2014/chartex" xmlns:cx1="http://schemas.microsoft.com/office/drawing/2015/9/8/chartex" xmlns:cx2="http://schemas.microsoft.com/office/drawing/2015/10/21/chartex" xmlns:cx3="http://schemas.microsoft.com/office/drawing/2016/5/9/chartex" xmlns:cx4="http://schemas.microsoft.com/office/drawing/2016/5/10/chartex" xmlns:cx5="http://schemas.microsoft.com/office/drawing/2016/5/11/chartex" xmlns:cx6="http://schemas.microsoft.com/office/drawing/2016/5/12/chartex" xmlns:cx7="http://schemas.microsoft.com/office/drawing/2016/5/13/chartex" xmlns:cx8="http://schemas.microsoft.com/office/drawing/2016/5/14/chartex" xmlns:mc="http://schemas.openxmlformats.org/markup-compatibility/2006" xmlns:aink="http://schemas.microsoft.com/office/drawing/2016/ink" xmlns:am3d="http://schemas.microsoft.com/office/drawing/2017/model3d" xmlns:o="urn:schemas-microsoft-com:office:office" xmlns:oel="http://schemas.microsoft.com/office/2019/extlst" xmlns:r="http://schemas.openxmlformats.org/officeDocument/2006/relationships" xmlns:m="http://schemas.openxmlformats.org/officeDocument/2006/math" xmlns:v="urn:schemas-microsoft-com:vml" xmlns:wp14="http://schemas.microsoft.com/office/word/2010/wordprocessingDrawing" xmlns:wp="http://schemas.openxmlformats.org/drawingml/2006/wordprocessingDrawing" xmlns:w10="urn:schemas-microsoft-com:office:word" xmlns:w="http://schemas.openxmlformats.org/wordprocessingml/2006/main" xmlns:w14="http://schemas.microsoft.com/office/word/2010/wordml" xmlns:w15="http://schemas.microsoft.com/office/word/2012/wordml" xmlns:w16cex="http://schemas.microsoft.com/office/word/2018/wordml/cex" xmlns:w16cid="http://schemas.microsoft.com/office/word/2016/wordml/cid" xmlns:w16="http://schemas.microsoft.com/office/word/2018/wordml" xmlns:w16du="http://schemas.microsoft.com/office/word/2023/wordml/word16du" xmlns:w16sdtdh="http://schemas.microsoft.com/office/word/2020/wordml/sdtdatahash" xmlns:w16sdtfl="http://schemas.microsoft.com/office/word/2024/wordml/sdtformatlock" xmlns:w16se="http://schemas.microsoft.com/office/word/2015/wordml/symex" xmlns:wpg="http://schemas.microsoft.com/office/word/2010/wordprocessingGroup" xmlns:wpi="http://schemas.microsoft.com/office/word/2010/wordprocessingInk" xmlns:wne="http://schemas.microsoft.com/office/word/2006/wordml" xmlns:wps="http://schemas.microsoft.com/office/word/2010/wordprocessingShape" mc:Ignorable="w14 w15 w16se w16cid w16 w16cex w16sdtdh w16sdtfl w16du wp14">
+<w:hdr xmlns:wpc="http://schemas.microsoft.com/office/word/2010/wordprocessingCanvas" xmlns:cx="http://schemas.microsoft.com/office/drawing/2014/chartex" xmlns:cx1="http://schemas.microsoft.com/office/drawing/2015/9/8/chartex" xmlns:cx2="http://schemas.microsoft.com/office/drawing/2015/10/21/chartex" xmlns:cx3="http://schemas.microsoft.com/office/drawing/2016/5/9/chartex" xmlns:cx4="http://schemas.microsoft.com/office/drawing/2016/5/10/chartex" xmlns:cx5="http://schemas.microsoft.com/office/drawing/2016/5/11/chartex" xmlns:cx6="http://schemas.microsoft.com/office/drawing/2016/5/12/chartex" xmlns:cx7="http://schemas.microsoft.com/office/drawing/2016/5/13/chartex" xmlns:cx8="http://schemas.microsoft.com/office/drawing/2016/5/14/chartex" xmlns:mc="http://schemas.openxmlformats.org/markup-compatibility/2006" xmlns:m="http://schemas.openxmlformats.org/officeDocument/2006/math" xmlns:aink="http://schemas.microsoft.com/office/drawing/2016/ink" xmlns:am3d="http://schemas.microsoft.com/office/drawing/2017/model3d" xmlns:oel="http://schemas.microsoft.com/office/2019/extlst" xmlns:r="http://schemas.openxmlformats.org/officeDocument/2006/relationships" xmlns:wp14="http://schemas.microsoft.com/office/word/2010/wordprocessingDrawing" xmlns:wp="http://schemas.openxmlformats.org/drawingml/2006/wordprocessingDrawing" xmlns:wpg="http://schemas.microsoft.com/office/word/2010/wordprocessingGroup" xmlns:wpi="http://schemas.microsoft.com/office/word/2010/wordprocessingInk" xmlns:wps="http://schemas.microsoft.com/office/word/2010/wordprocessingShape" xmlns:o="urn:schemas-microsoft-com:office:office" xmlns:v="urn:schemas-microsoft-com:vml" xmlns:w10="urn:schemas-microsoft-com:office:word" xmlns:w="http://schemas.openxmlformats.org/wordprocessingml/2006/main" xmlns:w14="http://schemas.microsoft.com/office/word/2010/wordml" xmlns:w15="http://schemas.microsoft.com/office/word/2012/wordml" xmlns:w16cei="http://schemas.microsoft.com/office/word/2026/wordml/cei" xmlns:w16cex="http://schemas.microsoft.com/office/word/2018/wordml/cex" xmlns:w16cid="http://schemas.microsoft.com/office/word/2016/wordml/cid" xmlns:w16="http://schemas.microsoft.com/office/word/2018/wordml" xmlns:w16sdtdh="http://schemas.microsoft.com/office/word/2020/wordml/sdtdatahash" xmlns:w16sdtfl="http://schemas.microsoft.com/office/word/2024/wordml/sdtformatlock" xmlns:w16se="http://schemas.microsoft.com/office/word/2015/wordml/symex" xmlns:w16du="http://schemas.microsoft.com/office/word/2023/wordml/word16du" xmlns:wne="http://schemas.microsoft.com/office/word/2006/wordml" mc:Ignorable="w14 w15 w16se w16cid w16 w16cex w16sdtdh w16sdtfl w16du wp14">
   <w:p>
     <w:pPr>
       <w:pStyle w:val="Header"/>
@@ -411,7 +411,7 @@
 </file>
 
 <file path=word/numbering.xml><?xml version="1.0" encoding="utf-8"?>
-<w:numbering xmlns:wpc="http://schemas.microsoft.com/office/word/2010/wordprocessingCanvas" xmlns:cx="http://schemas.microsoft.com/office/drawing/2014/chartex" xmlns:cx1="http://schemas.microsoft.com/office/drawing/2015/9/8/chartex" xmlns:cx2="http://schemas.microsoft.com/office/drawing/2015/10/21/chartex" xmlns:cx3="http://schemas.microsoft.com/office/drawing/2016/5/9/chartex" xmlns:cx4="http://schemas.microsoft.com/office/drawing/2016/5/10/chartex" xmlns:cx5="http://schemas.microsoft.com/office/drawing/2016/5/11/chartex" xmlns:cx6="http://schemas.microsoft.com/office/drawing/2016/5/12/chartex" xmlns:cx7="http://schemas.microsoft.com/office/drawing/2016/5/13/chartex" xmlns:cx8="http://schemas.microsoft.com/office/drawing/2016/5/14/chartex" xmlns:mc="http://schemas.openxmlformats.org/markup-compatibility/2006" xmlns:aink="http://schemas.microsoft.com/office/drawing/2016/ink" xmlns:am3d="http://schemas.microsoft.com/office/drawing/2017/model3d" xmlns:o="urn:schemas-microsoft-com:office:office" xmlns:oel="http://schemas.microsoft.com/office/2019/extlst" xmlns:r="http://schemas.openxmlformats.org/officeDocument/2006/relationships" xmlns:m="http://schemas.openxmlformats.org/officeDocument/2006/math" xmlns:v="urn:schemas-microsoft-com:vml" xmlns:wp14="http://schemas.microsoft.com/office/word/2010/wordprocessingDrawing" xmlns:wp="http://schemas.openxmlformats.org/drawingml/2006/wordprocessingDrawing" xmlns:w10="urn:schemas-microsoft-com:office:word" xmlns:w="http://schemas.openxmlformats.org/wordprocessingml/2006/main" xmlns:w14="http://schemas.microsoft.com/office/word/2010/wordml" xmlns:w15="http://schemas.microsoft.com/office/word/2012/wordml" xmlns:w16cex="http://schemas.microsoft.com/office/word/2018/wordml/cex" xmlns:w16cid="http://schemas.microsoft.com/office/word/2016/wordml/cid" xmlns:w16="http://schemas.microsoft.com/office/word/2018/wordml" xmlns:w16du="http://schemas.microsoft.com/office/word/2023/wordml/word16du" xmlns:w16sdtdh="http://schemas.microsoft.com/office/word/2020/wordml/sdtdatahash" xmlns:w16sdtfl="http://schemas.microsoft.com/office/word/2024/wordml/sdtformatlock" xmlns:w16se="http://schemas.microsoft.com/office/word/2015/wordml/symex" xmlns:wpg="http://schemas.microsoft.com/office/word/2010/wordprocessingGroup" xmlns:wpi="http://schemas.microsoft.com/office/word/2010/wordprocessingInk" xmlns:wne="http://schemas.microsoft.com/office/word/2006/wordml" xmlns:wps="http://schemas.microsoft.com/office/word/2010/wordprocessingShape" mc:Ignorable="w14 w15 w16se w16cid w16 w16cex w16sdtdh w16sdtfl w16du wp14">
+<w:numbering xmlns:wpc="http://schemas.microsoft.com/office/word/2010/wordprocessingCanvas" xmlns:cx="http://schemas.microsoft.com/office/drawing/2014/chartex" xmlns:cx1="http://schemas.microsoft.com/office/drawing/2015/9/8/chartex" xmlns:cx2="http://schemas.microsoft.com/office/drawing/2015/10/21/chartex" xmlns:cx3="http://schemas.microsoft.com/office/drawing/2016/5/9/chartex" xmlns:cx4="http://schemas.microsoft.com/office/drawing/2016/5/10/chartex" xmlns:cx5="http://schemas.microsoft.com/office/drawing/2016/5/11/chartex" xmlns:cx6="http://schemas.microsoft.com/office/drawing/2016/5/12/chartex" xmlns:cx7="http://schemas.microsoft.com/office/drawing/2016/5/13/chartex" xmlns:cx8="http://schemas.microsoft.com/office/drawing/2016/5/14/chartex" xmlns:mc="http://schemas.openxmlformats.org/markup-compatibility/2006" xmlns:m="http://schemas.openxmlformats.org/officeDocument/2006/math" xmlns:aink="http://schemas.microsoft.com/office/drawing/2016/ink" xmlns:am3d="http://schemas.microsoft.com/office/drawing/2017/model3d" xmlns:oel="http://schemas.microsoft.com/office/2019/extlst" xmlns:r="http://schemas.openxmlformats.org/officeDocument/2006/relationships" xmlns:wp14="http://schemas.microsoft.com/office/word/2010/wordprocessingDrawing" xmlns:wp="http://schemas.openxmlformats.org/drawingml/2006/wordprocessingDrawing" xmlns:wpg="http://schemas.microsoft.com/office/word/2010/wordprocessingGroup" xmlns:wpi="http://schemas.microsoft.com/office/word/2010/wordprocessingInk" xmlns:wps="http://schemas.microsoft.com/office/word/2010/wordprocessingShape" xmlns:o="urn:schemas-microsoft-com:office:office" xmlns:v="urn:schemas-microsoft-com:vml" xmlns:w10="urn:schemas-microsoft-com:office:word" xmlns:w="http://schemas.openxmlformats.org/wordprocessingml/2006/main" xmlns:w14="http://schemas.microsoft.com/office/word/2010/wordml" xmlns:w15="http://schemas.microsoft.com/office/word/2012/wordml" xmlns:w16cei="http://schemas.microsoft.com/office/word/2026/wordml/cei" xmlns:w16cex="http://schemas.microsoft.com/office/word/2018/wordml/cex" xmlns:w16cid="http://schemas.microsoft.com/office/word/2016/wordml/cid" xmlns:w16="http://schemas.microsoft.com/office/word/2018/wordml" xmlns:w16sdtdh="http://schemas.microsoft.com/office/word/2020/wordml/sdtdatahash" xmlns:w16sdtfl="http://schemas.microsoft.com/office/word/2024/wordml/sdtformatlock" xmlns:w16se="http://schemas.microsoft.com/office/word/2015/wordml/symex" xmlns:w16du="http://schemas.microsoft.com/office/word/2023/wordml/word16du" xmlns:wne="http://schemas.microsoft.com/office/word/2006/wordml" mc:Ignorable="w14 w15 w16se w16cid w16 w16cex w16sdtdh w16sdtfl w16du wp14">
   <w:abstractNum w:abstractNumId="0" w15:restartNumberingAfterBreak="0">
     <w:nsid w:val="01EF544C"/>
     <w:multiLevelType w:val="hybridMultilevel"/>
@@ -3141,7 +3141,7 @@
 </file>
 
 <file path=word/styles.xml><?xml version="1.0" encoding="utf-8"?>
-<w:styles xmlns:mc="http://schemas.openxmlformats.org/markup-compatibility/2006" xmlns:r="http://schemas.openxmlformats.org/officeDocument/2006/relationships" xmlns:w="http://schemas.openxmlformats.org/wordprocessingml/2006/main" xmlns:w14="http://schemas.microsoft.com/office/word/2010/wordml" xmlns:w15="http://schemas.microsoft.com/office/word/2012/wordml" xmlns:w16cex="http://schemas.microsoft.com/office/word/2018/wordml/cex" xmlns:w16cid="http://schemas.microsoft.com/office/word/2016/wordml/cid" xmlns:w16="http://schemas.microsoft.com/office/word/2018/wordml" xmlns:w16du="http://schemas.microsoft.com/office/word/2023/wordml/word16du" xmlns:w16sdtdh="http://schemas.microsoft.com/office/word/2020/wordml/sdtdatahash" xmlns:w16sdtfl="http://schemas.microsoft.com/office/word/2024/wordml/sdtformatlock" xmlns:w16se="http://schemas.microsoft.com/office/word/2015/wordml/symex" mc:Ignorable="w14 w15 w16se w16cid w16 w16cex w16sdtdh w16sdtfl w16du">
+<w:styles xmlns:mc="http://schemas.openxmlformats.org/markup-compatibility/2006" xmlns:r="http://schemas.openxmlformats.org/officeDocument/2006/relationships" xmlns:w="http://schemas.openxmlformats.org/wordprocessingml/2006/main" xmlns:w14="http://schemas.microsoft.com/office/word/2010/wordml" xmlns:w15="http://schemas.microsoft.com/office/word/2012/wordml" xmlns:w16cex="http://schemas.microsoft.com/office/word/2018/wordml/cex" xmlns:w16cid="http://schemas.microsoft.com/office/word/2016/wordml/cid" xmlns:w16="http://schemas.microsoft.com/office/word/2018/wordml" xmlns:w16sdtdh="http://schemas.microsoft.com/office/word/2020/wordml/sdtdatahash" xmlns:w16sdtfl="http://schemas.microsoft.com/office/word/2024/wordml/sdtformatlock" xmlns:w16se="http://schemas.microsoft.com/office/word/2015/wordml/symex" xmlns:w16du="http://schemas.microsoft.com/office/word/2023/wordml/word16du" mc:Ignorable="w14 w15 w16se w16cid w16 w16cex w16sdtdh w16sdtfl w16du">
   <w:docDefaults>
     <w:rPrDefault>
       <w:rPr>
@@ -4870,111 +4870,15 @@
 </file>
 
 <file path=customXml/item3.xml><?xml version="1.0" encoding="utf-8"?>
-<metadata xmlns="http://www.objective.com/ecm/document/metadata/B11C4AC340A7423FA2930B16A78B07CE" version="1.0.0">
-  <systemFields>
-    <field name="Objective-Id">
-      <value order="0">A9615613</value>
-    </field>
-    <field name="Objective-Title">
-      <value order="0">IPPO-Register-Template_AAGI_221006</value>
-    </field>
-    <field name="Objective-Description">
-      <value order="0"/>
-    </field>
-    <field name="Objective-CreationStamp">
-      <value order="0">2022-10-06T02:38:29Z</value>
-    </field>
-    <field name="Objective-IsApproved">
-      <value order="0">false</value>
-    </field>
-    <field name="Objective-IsPublished">
-      <value order="0">true</value>
-    </field>
-    <field name="Objective-DatePublished">
-      <value order="0">2022-10-06T03:27:02Z</value>
-    </field>
-    <field name="Objective-ModificationStamp">
-      <value order="0">2022-10-06T03:27:02Z</value>
-    </field>
-    <field name="Objective-Owner">
-      <value order="0">Daniel Taylor</value>
-    </field>
-    <field name="Objective-Path">
-      <value order="0">DPIRD Global Folder:00 Primary Industries Development:Policy Innovation &amp; Performance:Research Agreements and Contracts:13 Tenders in Progress:Farming Systems Innovation Tenders in Progress - PID (Primary Industries Development):PROC-9176683 - AAGI Analytics - K Reeves:PROC-9176683 - RFT</value>
-    </field>
-    <field name="Objective-Parent">
-      <value order="0">PROC-9176683 - RFT</value>
-    </field>
-    <field name="Objective-State">
-      <value order="0">Published</value>
-    </field>
-    <field name="Objective-VersionId">
-      <value order="0">vA11510538</value>
-    </field>
-    <field name="Objective-Version">
-      <value order="0">3.0</value>
-    </field>
-    <field name="Objective-VersionNumber">
-      <value order="0">3</value>
-    </field>
-    <field name="Objective-VersionComment">
-      <value order="0">Further review</value>
-    </field>
-    <field name="Objective-FileNumber">
-      <value order="0">220366</value>
-    </field>
-    <field name="Objective-Classification">
-      <value order="0">OFFICIAL</value>
-    </field>
-    <field name="Objective-Caveats">
-      <value order="0"/>
-    </field>
-  </systemFields>
-  <catalogues>
-    <catalogue name="Corporate Document Type Catalogue" type="type" ori="id:cA51">
-      <field name="Objective-Notes">
-        <value order="0"/>
-      </field>
-      <field name="Objective-Connect Creator">
-        <value order="0"/>
-      </field>
-      <field name="Objective-Migrated Provenance">
-        <value order="0"/>
-      </field>
-      <field name="Objective-Migrated Original ID">
-        <value order="0"/>
-      </field>
-      <field name="Objective-Migrated Object Type">
-        <value order="0"/>
-      </field>
-      <field name="Objective-Migrated Metadata Field">
-        <value order="0"/>
-      </field>
-      <field name="Objective-Number of Pages">
-        <value order="0"/>
-      </field>
-      <field name="Objective-Office Lodged">
-        <value order="0"/>
-      </field>
-      <field name="Objective-Allow Intranet Search">
-        <value order="0"/>
-      </field>
-    </catalogue>
-  </catalogues>
-</metadata>
+<?mso-contentType ?>
+<FormTemplates xmlns="http://schemas.microsoft.com/sharepoint/v3/contenttype/forms">
+  <Display>DocumentLibraryForm</Display>
+  <Edit>DocumentLibraryForm</Edit>
+  <New>DocumentLibraryForm</New>
+</FormTemplates>
 </file>
 
 <file path=customXml/item4.xml><?xml version="1.0" encoding="utf-8"?>
-<p:properties xmlns:p="http://schemas.microsoft.com/office/2006/metadata/properties" xmlns:xsi="http://www.w3.org/2001/XMLSchema-instance" xmlns:pc="http://schemas.microsoft.com/office/infopath/2007/PartnerControls">
-  <documentManagement>
-    <lcf76f155ced4ddcb4097134ff3c332f xmlns="5911c364-7b96-4628-b45a-3e57434dc305">
-      <Terms xmlns="http://schemas.microsoft.com/office/infopath/2007/PartnerControls"/>
-    </lcf76f155ced4ddcb4097134ff3c332f>
-  </documentManagement>
-</p:properties>
-</file>
-
-<file path=customXml/item5.xml><?xml version="1.0" encoding="utf-8"?>
 <ct:contentTypeSchema xmlns:ct="http://schemas.microsoft.com/office/2006/metadata/contentType" xmlns:ma="http://schemas.microsoft.com/office/2006/metadata/properties/metaAttributes" ct:_="" ma:_="" ma:contentTypeName="Document" ma:contentTypeID="0x0101001C6E07D54B3FDA42850BB3F0793140C7" ma:contentTypeVersion="10" ma:contentTypeDescription="Create a new document." ma:contentTypeScope="" ma:versionID="751be72b6fbc1c8c3e463a0f0081ea8a">
   <xsd:schema xmlns:xsd="http://www.w3.org/2001/XMLSchema" xmlns:xs="http://www.w3.org/2001/XMLSchema" xmlns:p="http://schemas.microsoft.com/office/2006/metadata/properties" xmlns:ns2="5911c364-7b96-4628-b45a-3e57434dc305" targetNamespace="http://schemas.microsoft.com/office/2006/metadata/properties" ma:root="true" ma:fieldsID="cc7f72680911fee76aac63c7af7de0b0" ns2:_="">
     <xsd:import namespace="5911c364-7b96-4628-b45a-3e57434dc305"/>
@@ -5152,13 +5056,109 @@
 </ct:contentTypeSchema>
 </file>
 
+<file path=customXml/item5.xml><?xml version="1.0" encoding="utf-8"?>
+<p:properties xmlns:p="http://schemas.microsoft.com/office/2006/metadata/properties" xmlns:xsi="http://www.w3.org/2001/XMLSchema-instance" xmlns:pc="http://schemas.microsoft.com/office/infopath/2007/PartnerControls">
+  <documentManagement>
+    <lcf76f155ced4ddcb4097134ff3c332f xmlns="5911c364-7b96-4628-b45a-3e57434dc305">
+      <Terms xmlns="http://schemas.microsoft.com/office/infopath/2007/PartnerControls"/>
+    </lcf76f155ced4ddcb4097134ff3c332f>
+  </documentManagement>
+</p:properties>
+</file>
+
 <file path=customXml/item6.xml><?xml version="1.0" encoding="utf-8"?>
-<?mso-contentType ?>
-<FormTemplates xmlns="http://schemas.microsoft.com/sharepoint/v3/contenttype/forms">
-  <Display>DocumentLibraryForm</Display>
-  <Edit>DocumentLibraryForm</Edit>
-  <New>DocumentLibraryForm</New>
-</FormTemplates>
+<metadata xmlns="http://www.objective.com/ecm/document/metadata/B11C4AC340A7423FA2930B16A78B07CE" version="1.0.0">
+  <systemFields>
+    <field name="Objective-Id">
+      <value order="0">A9615613</value>
+    </field>
+    <field name="Objective-Title">
+      <value order="0">IPPO-Register-Template_AAGI_221006</value>
+    </field>
+    <field name="Objective-Description">
+      <value order="0"/>
+    </field>
+    <field name="Objective-CreationStamp">
+      <value order="0">2022-10-06T02:38:29Z</value>
+    </field>
+    <field name="Objective-IsApproved">
+      <value order="0">false</value>
+    </field>
+    <field name="Objective-IsPublished">
+      <value order="0">true</value>
+    </field>
+    <field name="Objective-DatePublished">
+      <value order="0">2022-10-06T03:27:02Z</value>
+    </field>
+    <field name="Objective-ModificationStamp">
+      <value order="0">2022-10-06T03:27:02Z</value>
+    </field>
+    <field name="Objective-Owner">
+      <value order="0">Daniel Taylor</value>
+    </field>
+    <field name="Objective-Path">
+      <value order="0">DPIRD Global Folder:00 Primary Industries Development:Policy Innovation &amp; Performance:Research Agreements and Contracts:13 Tenders in Progress:Farming Systems Innovation Tenders in Progress - PID (Primary Industries Development):PROC-9176683 - AAGI Analytics - K Reeves:PROC-9176683 - RFT</value>
+    </field>
+    <field name="Objective-Parent">
+      <value order="0">PROC-9176683 - RFT</value>
+    </field>
+    <field name="Objective-State">
+      <value order="0">Published</value>
+    </field>
+    <field name="Objective-VersionId">
+      <value order="0">vA11510538</value>
+    </field>
+    <field name="Objective-Version">
+      <value order="0">3.0</value>
+    </field>
+    <field name="Objective-VersionNumber">
+      <value order="0">3</value>
+    </field>
+    <field name="Objective-VersionComment">
+      <value order="0">Further review</value>
+    </field>
+    <field name="Objective-FileNumber">
+      <value order="0">220366</value>
+    </field>
+    <field name="Objective-Classification">
+      <value order="0">OFFICIAL</value>
+    </field>
+    <field name="Objective-Caveats">
+      <value order="0"/>
+    </field>
+  </systemFields>
+  <catalogues>
+    <catalogue name="Corporate Document Type Catalogue" type="type" ori="id:cA51">
+      <field name="Objective-Notes">
+        <value order="0"/>
+      </field>
+      <field name="Objective-Connect Creator">
+        <value order="0"/>
+      </field>
+      <field name="Objective-Migrated Provenance">
+        <value order="0"/>
+      </field>
+      <field name="Objective-Migrated Original ID">
+        <value order="0"/>
+      </field>
+      <field name="Objective-Migrated Object Type">
+        <value order="0"/>
+      </field>
+      <field name="Objective-Migrated Metadata Field">
+        <value order="0"/>
+      </field>
+      <field name="Objective-Number of Pages">
+        <value order="0"/>
+      </field>
+      <field name="Objective-Office Lodged">
+        <value order="0"/>
+      </field>
+      <field name="Objective-Allow Intranet Search">
+        <value order="0"/>
+      </field>
+    </catalogue>
+  </catalogues>
+</metadata>
 </file>
 
 <file path=customXml/itemProps1.xml><?xml version="1.0" encoding="utf-8"?>
@@ -5178,24 +5178,14 @@
 </file>
 
 <file path=customXml/itemProps3.xml><?xml version="1.0" encoding="utf-8"?>
-<ds:datastoreItem xmlns:ds="http://schemas.openxmlformats.org/officeDocument/2006/customXml" ds:itemID="{5745109E-2DDF-40CB-AC2B-FF9B10C90820}">
+<ds:datastoreItem xmlns:ds="http://schemas.openxmlformats.org/officeDocument/2006/customXml" ds:itemID="{9B7F7A53-9B1E-48FA-98AC-B1620C85AF44}">
   <ds:schemaRefs>
-    <ds:schemaRef ds:uri="http://www.objective.com/ecm/document/metadata/B11C4AC340A7423FA2930B16A78B07CE"/>
+    <ds:schemaRef ds:uri="http://schemas.microsoft.com/sharepoint/v3/contenttype/forms"/>
   </ds:schemaRefs>
 </ds:datastoreItem>
 </file>
 
 <file path=customXml/itemProps4.xml><?xml version="1.0" encoding="utf-8"?>
-<ds:datastoreItem xmlns:ds="http://schemas.openxmlformats.org/officeDocument/2006/customXml" ds:itemID="{8031C185-2984-4D53-8334-F0AED863A240}">
-  <ds:schemaRefs>
-    <ds:schemaRef ds:uri="http://schemas.microsoft.com/office/2006/metadata/properties"/>
-    <ds:schemaRef ds:uri="http://schemas.microsoft.com/office/infopath/2007/PartnerControls"/>
-    <ds:schemaRef ds:uri="5911c364-7b96-4628-b45a-3e57434dc305"/>
-  </ds:schemaRefs>
-</ds:datastoreItem>
-</file>
-
-<file path=customXml/itemProps5.xml><?xml version="1.0" encoding="utf-8"?>
 <ds:datastoreItem xmlns:ds="http://schemas.openxmlformats.org/officeDocument/2006/customXml" ds:itemID="{3D88C0CD-2778-447B-90B3-A5C526177372}">
   <ds:schemaRefs>
     <ds:schemaRef ds:uri="http://schemas.microsoft.com/office/2006/metadata/contentType"/>
@@ -5213,10 +5203,20 @@
 </ds:datastoreItem>
 </file>
 
+<file path=customXml/itemProps5.xml><?xml version="1.0" encoding="utf-8"?>
+<ds:datastoreItem xmlns:ds="http://schemas.openxmlformats.org/officeDocument/2006/customXml" ds:itemID="{8031C185-2984-4D53-8334-F0AED863A240}">
+  <ds:schemaRefs>
+    <ds:schemaRef ds:uri="http://schemas.microsoft.com/office/2006/metadata/properties"/>
+    <ds:schemaRef ds:uri="http://schemas.microsoft.com/office/infopath/2007/PartnerControls"/>
+    <ds:schemaRef ds:uri="5911c364-7b96-4628-b45a-3e57434dc305"/>
+  </ds:schemaRefs>
+</ds:datastoreItem>
+</file>
+
 <file path=customXml/itemProps6.xml><?xml version="1.0" encoding="utf-8"?>
-<ds:datastoreItem xmlns:ds="http://schemas.openxmlformats.org/officeDocument/2006/customXml" ds:itemID="{9B7F7A53-9B1E-48FA-98AC-B1620C85AF44}">
+<ds:datastoreItem xmlns:ds="http://schemas.openxmlformats.org/officeDocument/2006/customXml" ds:itemID="{5745109E-2DDF-40CB-AC2B-FF9B10C90820}">
   <ds:schemaRefs>
-    <ds:schemaRef ds:uri="http://schemas.microsoft.com/sharepoint/v3/contenttype/forms"/>
+    <ds:schemaRef ds:uri="http://www.objective.com/ecm/document/metadata/B11C4AC340A7423FA2930B16A78B07CE"/>
   </ds:schemaRefs>
 </ds:datastoreItem>
 </file>
</xml_diff>